<commit_message>
Deployment report: Cloud Shell path, free-tier costs, cold-start work
</commit_message>
<xml_diff>
--- a/docs/deliverables/Meridian_Deployment_Report.docx
+++ b/docs/deliverables/Meridian_Deployment_Report.docx
@@ -677,7 +677,7 @@
           <w:sz w:val="20"/>
           <w:szCs w:val="20"/>
         </w:rPr>
-        <w:t xml:space="preserve">From the repository root, once per project:</w:t>
+        <w:t xml:space="preserve">Run from Google Cloud Shell (shell.cloud.google.com), a browser terminal with gcloud and git already installed, so the deployment needs nothing installed locally. Once per project:</w:t>
       </w:r>
     </w:p>
     <w:p>
@@ -691,7 +691,7 @@
           <w:sz w:val="17"/>
           <w:szCs w:val="17"/>
         </w:rPr>
-        <w:t xml:space="preserve">gcloud auth login</w:t>
+        <w:t xml:space="preserve">gcloud config set project YOUR_PROJECT_ID</w:t>
       </w:r>
     </w:p>
     <w:p>
@@ -705,7 +705,7 @@
           <w:sz w:val="17"/>
           <w:szCs w:val="17"/>
         </w:rPr>
-        <w:t xml:space="preserve">gcloud config set project YOUR_PROJECT_ID</w:t>
+        <w:t xml:space="preserve">gcloud services enable run.googleapis.com cloudbuild.googleapis.com \</w:t>
       </w:r>
     </w:p>
     <w:p>
@@ -719,19 +719,7 @@
           <w:sz w:val="17"/>
           <w:szCs w:val="17"/>
         </w:rPr>
-        <w:t xml:space="preserve">gcloud services enable run.googleapis.com cloudbuild.googleapis.com</w:t>
-      </w:r>
-    </w:p>
-    <w:p>
-      <w:pPr>
-        <w:spacing w:after="130" w:line="268"/>
-      </w:pPr>
-      <w:r>
-        <w:rPr>
-          <w:sz w:val="20"/>
-          <w:szCs w:val="20"/>
-        </w:rPr>
-        <w:t xml:space="preserve">Then to deploy, and again for any future update:</w:t>
+        <w:t xml:space="preserve">    artifactregistry.googleapis.com</w:t>
       </w:r>
     </w:p>
     <w:p>
@@ -745,7 +733,19 @@
           <w:sz w:val="17"/>
           <w:szCs w:val="17"/>
         </w:rPr>
-        <w:t xml:space="preserve">gcloud run deploy meridian --source . --region us-central1 \</w:t>
+        <w:t xml:space="preserve">git clone https://github.com/darrshen97-ui/Meridian.git &amp;&amp; cd Meridian</w:t>
+      </w:r>
+    </w:p>
+    <w:p>
+      <w:pPr>
+        <w:spacing w:after="130" w:line="268"/>
+      </w:pPr>
+      <w:r>
+        <w:rPr>
+          <w:sz w:val="20"/>
+          <w:szCs w:val="20"/>
+        </w:rPr>
+        <w:t xml:space="preserve">Then to deploy, and again for any future update:</w:t>
       </w:r>
     </w:p>
     <w:p>
@@ -759,7 +759,35 @@
           <w:sz w:val="17"/>
           <w:szCs w:val="17"/>
         </w:rPr>
-        <w:t xml:space="preserve">    --allow-unauthenticated --max-instances 1 --memory 1Gi</w:t>
+        <w:t xml:space="preserve">gcloud run deploy meridian --source . --region us-central1 \</w:t>
+      </w:r>
+    </w:p>
+    <w:p>
+      <w:pPr>
+        <w:shd w:fill="F4F4F2" w:color="auto" w:val="clear"/>
+        <w:spacing w:after="90" w:line="250"/>
+      </w:pPr>
+      <w:r>
+        <w:rPr>
+          <w:rFonts w:ascii="Consolas" w:cs="Consolas" w:eastAsia="Consolas" w:hAnsi="Consolas"/>
+          <w:sz w:val="17"/>
+          <w:szCs w:val="17"/>
+        </w:rPr>
+        <w:t xml:space="preserve">    --allow-unauthenticated --max-instances 1 --memory 1Gi \</w:t>
+      </w:r>
+    </w:p>
+    <w:p>
+      <w:pPr>
+        <w:shd w:fill="F4F4F2" w:color="auto" w:val="clear"/>
+        <w:spacing w:after="90" w:line="250"/>
+      </w:pPr>
+      <w:r>
+        <w:rPr>
+          <w:rFonts w:ascii="Consolas" w:cs="Consolas" w:eastAsia="Consolas" w:hAnsi="Consolas"/>
+          <w:sz w:val="17"/>
+          <w:szCs w:val="17"/>
+        </w:rPr>
+        <w:t xml:space="preserve">    --set-env-vars JWT_SECRET=$(openssl rand -base64 36)</w:t>
       </w:r>
     </w:p>
     <w:p>
@@ -771,7 +799,33 @@
           <w:sz w:val="20"/>
           <w:szCs w:val="20"/>
         </w:rPr>
-        <w:t xml:space="preserve">Cloud Build reads the committed Dockerfile, builds the image, and Cloud Run publishes it. The command prints the public URL when it finishes.</w:t>
+        <w:t xml:space="preserve">Cloud Build reads the committed Dockerfile, builds the image, and Cloud Run publishes it. The command prints the public URL when it finishes. One instance because the database is a file inside the container; a fixed session key because otherwise a new one is generated on each cold start and signs everyone out; and no --min-instances, which is what lets the service scale to zero and cost nothing while idle.</w:t>
+      </w:r>
+    </w:p>
+    <w:p>
+      <w:pPr>
+        <w:spacing w:after="90" w:before="180"/>
+      </w:pPr>
+      <w:r>
+        <w:rPr>
+          <w:b/>
+          <w:bCs/>
+          <w:sz w:val="21"/>
+          <w:szCs w:val="21"/>
+        </w:rPr>
+        <w:t xml:space="preserve">What it costs</w:t>
+      </w:r>
+    </w:p>
+    <w:p>
+      <w:pPr>
+        <w:spacing w:after="130" w:line="268"/>
+      </w:pPr>
+      <w:r>
+        <w:rPr>
+          <w:sz w:val="20"/>
+          <w:szCs w:val="20"/>
+        </w:rPr>
+        <w:t xml:space="preserve">Nothing, at this scale. Cloud Run bills for the time a container is actually serving a request, and its permanent monthly free tier — on the order of two million requests and 180,000 vCPU-seconds — is far beyond what a demonstration uses. Between visits the service runs zero instances and bills zero. Cloud Build and the image registry are likewise inside their free allowances for an image this size. A billing account has to be attached to the project even so.</w:t>
       </w:r>
     </w:p>
     <w:p>
@@ -1138,6 +1192,32 @@
           <w:szCs w:val="20"/>
         </w:rPr>
         <w:t xml:space="preserve">The lesson matches the one from the testing assignment: a green test run proves the code is correct in the environment the tests run in, and deployment is a different environment.</w:t>
+      </w:r>
+    </w:p>
+    <w:p>
+      <w:pPr>
+        <w:spacing w:after="90" w:before="180"/>
+      </w:pPr>
+      <w:r>
+        <w:rPr>
+          <w:b/>
+          <w:bCs/>
+          <w:sz w:val="21"/>
+          <w:szCs w:val="21"/>
+        </w:rPr>
+        <w:t xml:space="preserve">Paying for the same work on every visit</w:t>
+      </w:r>
+    </w:p>
+    <w:p>
+      <w:pPr>
+        <w:spacing w:after="130" w:line="268"/>
+      </w:pPr>
+      <w:r>
+        <w:rPr>
+          <w:sz w:val="20"/>
+          <w:szCs w:val="20"/>
+        </w:rPr>
+        <w:t xml:space="preserve">Scale-to-zero has a cost of its own: the first request after an idle period waits for a container to start, and the start-up applied database migrations and seeded 3,350 transactions every single time — identical work with an identical result, charged as CPU and paid for in latency by whoever arrived first. The database is now built once during the image build and copied into place at start-up, which measured 4.4 seconds down to 0.76. The original path still runs when no prepared database is present, so an older image, or a future move to a hosted database, starts correctly either way.</w:t>
       </w:r>
     </w:p>
     <w:p>

</xml_diff>

<commit_message>
Deployment report: live URL, verification results, the path bugs
</commit_message>
<xml_diff>
--- a/docs/deliverables/Meridian_Deployment_Report.docx
+++ b/docs/deliverables/Meridian_Deployment_Report.docx
@@ -74,18 +74,6 @@
     </w:p>
     <w:p>
       <w:pPr>
-        <w:spacing w:after="130" w:line="268"/>
-      </w:pPr>
-      <w:r>
-        <w:rPr>
-          <w:sz w:val="20"/>
-          <w:szCs w:val="20"/>
-        </w:rPr>
-        <w:t xml:space="preserve">Cloud Run assigns the URL when the service is first deployed. Paste it here once the deploy completes:</w:t>
-      </w:r>
-    </w:p>
-    <w:p>
-      <w:pPr>
         <w:shd w:fill="F4F4F2" w:color="auto" w:val="clear"/>
         <w:spacing w:after="90" w:line="250"/>
       </w:pPr>
@@ -95,7 +83,19 @@
           <w:sz w:val="17"/>
           <w:szCs w:val="17"/>
         </w:rPr>
-        <w:t xml:space="preserve">https://______________________.run.app</w:t>
+        <w:t xml:space="preserve">https://meridian-792468836580.us-central1.run.app</w:t>
+      </w:r>
+    </w:p>
+    <w:p>
+      <w:pPr>
+        <w:spacing w:after="130" w:line="268"/>
+      </w:pPr>
+      <w:r>
+        <w:rPr>
+          <w:sz w:val="20"/>
+          <w:szCs w:val="20"/>
+        </w:rPr>
+        <w:t xml:space="preserve">Sign in with either demo profile — the welcome screen fills the password in. Jordan Reyes opens on a year of imported statements, reconciled periods and budget targets; Priya Raman is a second, entirely separate ledger.</w:t>
       </w:r>
     </w:p>
     <w:p>
@@ -648,7 +648,78 @@
                 <w:sz w:val="17"/>
                 <w:szCs w:val="17"/>
               </w:rPr>
-              <w:t xml:space="preserve">Loaded the public URL, signed in as the demo profile, exercised each screen, and checked it on a phone.</w:t>
+              <w:t xml:space="preserve">Signed in as both demo profiles against the deployed service and exercised every screen: 117 and 36 imported documents, 79 and 36 reconciled periods, budget targets, the review queue, and a document opened from storage. Warm responses came back in about 0.3 s.</w:t>
+            </w:r>
+          </w:p>
+        </w:tc>
+      </w:tr>
+      <w:tr>
+        <w:tc>
+          <w:tcPr>
+            <w:tcW w:type="dxa" w:w="420"/>
+            <w:tcMar>
+              <w:top w:type="dxa" w:w="70"/>
+              <w:left w:type="dxa" w:w="90"/>
+              <w:bottom w:type="dxa" w:w="70"/>
+              <w:right w:type="dxa" w:w="90"/>
+            </w:tcMar>
+          </w:tcPr>
+          <w:p>
+            <w:pPr>
+              <w:spacing w:after="0" w:line="240"/>
+            </w:pPr>
+            <w:r>
+              <w:rPr>
+                <w:sz w:val="17"/>
+                <w:szCs w:val="17"/>
+              </w:rPr>
+              <w:t xml:space="preserve">7</w:t>
+            </w:r>
+          </w:p>
+        </w:tc>
+        <w:tc>
+          <w:tcPr>
+            <w:tcW w:type="dxa" w:w="1900"/>
+            <w:tcMar>
+              <w:top w:type="dxa" w:w="70"/>
+              <w:left w:type="dxa" w:w="90"/>
+              <w:bottom w:type="dxa" w:w="70"/>
+              <w:right w:type="dxa" w:w="90"/>
+            </w:tcMar>
+          </w:tcPr>
+          <w:p>
+            <w:pPr>
+              <w:spacing w:after="0" w:line="240"/>
+            </w:pPr>
+            <w:r>
+              <w:rPr>
+                <w:sz w:val="17"/>
+                <w:szCs w:val="17"/>
+              </w:rPr>
+              <w:t xml:space="preserve">Fixed what deploying exposed</w:t>
+            </w:r>
+          </w:p>
+        </w:tc>
+        <w:tc>
+          <w:tcPr>
+            <w:tcW w:type="dxa" w:w="7040"/>
+            <w:tcMar>
+              <w:top w:type="dxa" w:w="70"/>
+              <w:left w:type="dxa" w:w="90"/>
+              <w:bottom w:type="dxa" w:w="70"/>
+              <w:right w:type="dxa" w:w="90"/>
+            </w:tcMar>
+          </w:tcPr>
+          <w:p>
+            <w:pPr>
+              <w:spacing w:after="0" w:line="240"/>
+            </w:pPr>
+            <w:r>
+              <w:rPr>
+                <w:sz w:val="17"/>
+                <w:szCs w:val="17"/>
+              </w:rPr>
+              <w:t xml:space="preserve">Two defects that only appear once the app is built in one place and run in another: an absolute SQLite path that silently became relative, and document rows recording absolute file paths, which would have made every document unreadable in the container. Both now have regression tests.</w:t>
             </w:r>
           </w:p>
         </w:tc>
@@ -942,7 +1013,7 @@
           <w:sz w:val="21"/>
           <w:szCs w:val="21"/>
         </w:rPr>
-        <w:t xml:space="preserve">Screenshot 2 — the Cloud Run console showing both services running</w:t>
+        <w:t xml:space="preserve">Screenshot 2 — the Cloud Run console showing the service running</w:t>
       </w:r>
     </w:p>
     <w:tbl>
@@ -1000,7 +1071,7 @@
                 <w:sz w:val="17"/>
                 <w:szCs w:val="17"/>
               </w:rPr>
-              <w:t xml:space="preserve">Google Cloud console → Cloud Run, showing this service and the first application's service, both with a green Running status, with the system clock visible.</w:t>
+              <w:t xml:space="preserve">Google Cloud console → Cloud Run, showing the meridian service with a green tick and its URL, with the system clock visible. (The first application is on Firebase Hosting, not Cloud Run, so it does not appear on this page — a static site has no container to run.)</w:t>
             </w:r>
           </w:p>
         </w:tc>
@@ -1167,7 +1238,7 @@
           <w:sz w:val="21"/>
           <w:szCs w:val="21"/>
         </w:rPr>
-        <w:t xml:space="preserve">A path bug that only exists in a container</w:t>
+        <w:t xml:space="preserve">Two path bugs that only exist once the app moves</w:t>
       </w:r>
     </w:p>
     <w:p>
@@ -1191,7 +1262,19 @@
           <w:sz w:val="20"/>
           <w:szCs w:val="20"/>
         </w:rPr>
-        <w:t xml:space="preserve">The lesson matches the one from the testing assignment: a green test run proves the code is correct in the environment the tests run in, and deployment is a different environment.</w:t>
+        <w:t xml:space="preserve">The second was the same shape and cost more. Uploaded statements were recorded in the database by absolute path. That is harmless while one machine writes and reads them, and wrong the moment the database is built somewhere and opened somewhere else — which is exactly what a container image and a downloadable zip both do. Every document row would have pointed at a file that did not exist, and the Documents screen would have failed on all 153 of them while still listing them as imported. Paths are now stored relative to the data directory.</w:t>
+      </w:r>
+    </w:p>
+    <w:p>
+      <w:pPr>
+        <w:spacing w:after="130" w:line="268"/>
+      </w:pPr>
+      <w:r>
+        <w:rPr>
+          <w:sz w:val="20"/>
+          <w:szCs w:val="20"/>
+        </w:rPr>
+        <w:t xml:space="preserve">The lesson matches the one from the testing assignment: a green test run proves the code is correct in the environment the tests run in, and deployment is a different environment. Both of these were found by running the deployment artefact, not by reading it.</w:t>
       </w:r>
     </w:p>
     <w:p>

</xml_diff>